<commit_message>
Rename Second Pond to L Mackintosh Pond throughout — database, scripts, and all output documents
</commit_message>
<xml_diff>
--- a/output/MBTS_eDNA_Report_v39.docx
+++ b/output/MBTS_eDNA_Report_v39.docx
@@ -95,7 +95,7 @@
         <w:pStyle w:val="BodyText"/>
       </w:pPr>
       <w:r>
-        <w:t xml:space="preserve">The Manchester-by-the-Sea Brook Trout Monitoring Program (MBTS) tracks the health and status of Sawmill Brook — a small suburban coastal stream that drains southwest into Manchester Harbor. The sampling network covers the full longitudinal gradient: from Second Pond and Cat Brook headwaters through the main stem, from the estuarine School Street reach to the tidal limit at Fire Station.</w:t>
+        <w:t>The Manchester-by-the-Sea Brook Trout Monitoring Program (MBTS) tracks the health and status of Sawmill Brook — a small suburban coastal stream that drains southwest into Manchester Harbor. The sampling network covers the full longitudinal gradient: from L Mackintosh Pond and Cat Brook headwaters through the main stem, from the estuarine School Street reach to the tidal limit at Fire Station.</w:t>
       </w:r>
     </w:p>
     <w:p>
@@ -1324,19 +1324,19 @@
                 <w:bCs/>
                 <w:b/>
               </w:rPr>
-              <w:t xml:space="preserve">Alewife at 63% — Second Pond only</w:t>
-            </w:r>
-          </w:p>
-        </w:tc>
-        <w:tc>
-          <w:tcPr/>
-          <w:p>
-            <w:pPr>
-              <w:pStyle w:val="Compact"/>
-              <w:jc w:val="left"/>
-            </w:pPr>
-            <w:r>
-              <w:t xml:space="preserve">Second Pond (Oct 2024)</w:t>
+              <w:t>Alewife at 63% — L Mackintosh Pond only</w:t>
+            </w:r>
+          </w:p>
+        </w:tc>
+        <w:tc>
+          <w:tcPr/>
+          <w:p>
+            <w:pPr>
+              <w:pStyle w:val="Compact"/>
+              <w:jc w:val="left"/>
+            </w:pPr>
+            <w:r>
+              <w:t>L Mackintosh Pond (Oct 2024)</w:t>
             </w:r>
           </w:p>
         </w:tc>
@@ -2046,7 +2046,7 @@
               <w:jc w:val="left"/>
             </w:pPr>
             <w:r>
-              <w:t xml:space="preserve">Only at Second Pond — fishway investigation required</w:t>
+              <w:t>Only at L Mackintosh Pond — fishway investigation required</w:t>
             </w:r>
           </w:p>
         </w:tc>
@@ -2264,7 +2264,7 @@
         <w:pStyle w:val="BodyText"/>
       </w:pPr>
       <w:r>
-        <w:t xml:space="preserve">The Sawmill Brook system in Manchester-by-the-Sea is the most intensively monitored watershed in Massachusetts in this study — thirteen samples across nineteen months at multiple reaches from Cat Brook headwaters and Second Pond through the mainstem to the tidal mouth at School Street, draining southwest into Manchester Harbor. The Manchester-by-the-Sea Brook Trout monitoring program (MBTS) tracks the health and status of a suburban coastal stream. Early samples (November 2023, August 2024) carry both fish and algal data; later samples are fish-only.</w:t>
+        <w:t>The Sawmill Brook system in Manchester-by-the-Sea is the most intensively monitored watershed in Massachusetts in this study — thirteen samples across nineteen months at multiple reaches from Cat Brook headwaters and L Mackintosh Pond through the mainstem to the tidal mouth at School Street, draining southwest into Manchester Harbor. The Manchester-by-the-Sea Brook Trout monitoring program (MBTS) tracks the health and status of a suburban coastal stream. Early samples (November 2023, August 2024) carry both fish and algal data; later samples are fish-only.</w:t>
       </w:r>
     </w:p>
     <w:p>
@@ -2272,7 +2272,7 @@
         <w:pStyle w:val="BodyText"/>
       </w:pPr>
       <w:r>
-        <w:t xml:space="preserve">Second Pond is a headwater impoundment feeding into Cat Brook, which drains to Sawmill Brook.</w:t>
+        <w:t>L Mackintosh Pond is a headwater impoundment feeding into Cat Brook, which drains to Sawmill Brook.</w:t>
       </w:r>
       <w:r>
         <w:t xml:space="preserve"> </w:t>
@@ -2282,13 +2282,13 @@
           <w:bCs/>
           <w:b/>
         </w:rPr>
-        <w:t xml:space="preserve">Alewife at 63% at Second Pond in October is an exceptional finding</w:t>
-      </w:r>
-      <w:r>
-        <w:t xml:space="preserve"> </w:t>
-      </w:r>
-      <w:r>
-        <w:t xml:space="preserve">— Alewife are essentially absent from the rest of the MBTS system, making this the only confirmed Alewife presence in the entire watershed. This signals a direct ocean connectivity pathway through Second Pond and Cat Brook that may be available only seasonally or at specific water levels.</w:t>
+        <w:t>Alewife at 63% at L Mackintosh Pond in October is an exceptional finding</w:t>
+      </w:r>
+      <w:r>
+        <w:t xml:space="preserve"> </w:t>
+      </w:r>
+      <w:r>
+        <w:t>— Alewife are essentially absent from the rest of the MBTS system, making this the only confirmed Alewife presence in the entire watershed. This signals a direct ocean connectivity pathway through L Mackintosh Pond and Cat Brook that may be available only seasonally or at specific water levels.</w:t>
       </w:r>
     </w:p>
     <w:p>
@@ -2316,7 +2316,7 @@
           <w:bCs/>
           <w:b/>
         </w:rPr>
-        <w:t xml:space="preserve">spp. detected at Second Pond (October 2024) — native pickerel;</w:t>
+        <w:t>spp. detected at L Mackintosh Pond (October 2024) — native pickerel;</w:t>
       </w:r>
       <w:r>
         <w:rPr>
@@ -7142,7 +7142,7 @@
         <w:pStyle w:val="Heading2"/>
       </w:pPr>
       <w:r>
-        <w:t xml:space="preserve">Second Pond, Manchester-by-the-Sea, MA | JVB4678 / OC41MHKC.1 | October 15, 2024</w:t>
+        <w:t>L Mackintosh Pond, Manchester-by-the-Sea, MA | JVB4678 / OC41MHKC.1 | October 15, 2024</w:t>
       </w:r>
     </w:p>
     <w:p>
@@ -7219,7 +7219,7 @@
         <w:pStyle w:val="FirstParagraph"/>
       </w:pPr>
       <w:r>
-        <w:t xml:space="preserve">Second Pond in October is a mesotrophic coastal pond in the middle of its fall transition — diatoms dominating (42.9%), with unusual secondary taxa including</w:t>
+        <w:t>L Mackintosh Pond in October is a mesotrophic coastal pond in the middle of its fall transition — diatoms dominating (42.9%), with unusual secondary taxa including</w:t>
       </w:r>
       <w:r>
         <w:t xml:space="preserve"> </w:t>
@@ -8653,7 +8653,7 @@
         <w:pStyle w:val="FirstParagraph"/>
       </w:pPr>
       <w:r>
-        <w:t xml:space="preserve">Second Pond October 2024 presents a fall transitional mesotrophic coastal pond signal — diatom-dominated, with the added complexity of</w:t>
+        <w:t>L Mackintosh Pond October 2024 presents a fall transitional mesotrophic coastal pond signal — diatom-dominated, with the added complexity of</w:t>
       </w:r>
       <w:r>
         <w:t xml:space="preserve"> </w:t>
@@ -8701,7 +8701,7 @@
         <w:t xml:space="preserve"> </w:t>
       </w:r>
       <w:r>
-        <w:t xml:space="preserve">is best known as the causative organism of brown tide events in Texas coastal embayments (Laguna Madre); its presence in Second Pond is ecologically unexpected and may reflect database misassignment of a closely related freshwater pelagophyte. Without ESV-level expert review, the</w:t>
+        <w:t>is best known as the causative organism of brown tide events in Texas coastal embayments (Laguna Madre); its presence in L Mackintosh Pond is ecologically unexpected and may reflect database misassignment of a closely related freshwater pelagophyte. Without ESV-level expert review, the</w:t>
       </w:r>
       <w:r>
         <w:t xml:space="preserve"> </w:t>
@@ -8751,7 +8751,7 @@
         <w:t xml:space="preserve"> </w:t>
       </w:r>
       <w:r>
-        <w:t xml:space="preserve">at 3.0% provides a cold-water oligotrophic baseline signal consistent with Second Pond being a moderately deep coastal kettle pond with residual cold-water character.</w:t>
+        <w:t>at 3.0% provides a cold-water oligotrophic baseline signal consistent with L Mackintosh Pond being a moderately deep coastal kettle pond with residual cold-water character.</w:t>
       </w:r>
     </w:p>
     <w:p>
@@ -8759,7 +8759,7 @@
         <w:pStyle w:val="BodyText"/>
       </w:pPr>
       <w:r>
-        <w:t xml:space="preserve">Common Carp (Cyprinus carpio) — BLAST-confirmed at 4,093 reads (~30% of fish reads at this site) — is the most significant new finding at Second Pond from the full BLAST run. Carp were previously unresolved (species=None) and excluded from the v38 community analysis. Their identification substantially revises the site picture: Alewife is no longer dominant at 63% but closer to 44% once Carp reads are included in the denominator. Carp are an introduced species with a well-documented capacity to degrade aquatic habitat through bottom-rooting, sediment resuspension, and uprooting of macrophytes. A 30% Carp signal in a headwater pond that also supports Alewife, Tessellated Darter, and potential Brook Trout connectivity is a serious conservation flag. Fathead Minnow (Pimephales promelas, ~5%) is a second introduced species now confirmed by BLAST — a common bait-bucket introduction. Both species should be flagged to MassWildlife and the town conservation commission.</w:t>
+        <w:t xml:space="preserve">Common Carp (Cyprinus carpio) — BLAST-confirmed at 4,093 reads (~30% of fish reads at this site) — is the most significant new finding at L Mackintosh Pond from the full BLAST run. Carp were previously unresolved (species=None) and excluded from the v38 community analysis. Their identification substantially revises the site picture: Alewife is no longer dominant at 63% but closer to 44% once Carp reads are included in the denominator. Carp are an introduced species with a well-documented capacity to degrade aquatic habitat through bottom-rooting, sediment resuspension, and uprooting of macrophytes. A 30% Carp signal in a headwater pond that also supports Alewife, Tessellated Darter, and potential Brook Trout connectivity is a serious conservation flag. Fathead Minnow (Pimephales promelas, ~5%) is a second introduced species now confirmed by BLAST — a common bait-bucket introduction. Both species should be flagged to MassWildlife and the town conservation commission.</w:t>
       </w:r>
     </w:p>
     <w:p>
@@ -8777,7 +8777,7 @@
         <w:t xml:space="preserve"> </w:t>
       </w:r>
       <w:r>
-        <w:t xml:space="preserve">at 3.0% provides a cold-water oligotrophic baseline signal consistent with Second Pond being a moderately deep coastal kettle pond with residual cold-water character.</w:t>
+        <w:t>at 3.0% provides a cold-water oligotrophic baseline signal consistent with L Mackintosh Pond being a moderately deep coastal kettle pond with residual cold-water character.</w:t>
       </w:r>
     </w:p>
     <w:p>
@@ -13723,7 +13723,7 @@
         <w:t xml:space="preserve"> </w:t>
       </w:r>
       <w:r>
-        <w:t xml:space="preserve">Alewife is confirmed at Second Pond (Cat Brook headwater) — not at mid-watershed reaches above the tidal zone.</w:t>
+        <w:t>Alewife is confirmed at L Mackintosh Pond (Cat Brook headwater) — not at mid-watershed reaches above the tidal zone.</w:t>
       </w:r>
     </w:p>
     <w:bookmarkEnd w:id="98"/>

</xml_diff>